<commit_message>
Rewrite Chapter 5 and 6 answers in a more natural voice
Co-Authored-By: Claude Opus 5.5 <noreply@anthropic.com>
Claude-Session: https://claude.ai/code/session_015Pbn36PiRkhzEJDeNyRJtX
</commit_message>
<xml_diff>
--- a/Chapter5_Exercise.docx
+++ b/Chapter5_Exercise.docx
@@ -12,8 +12,8 @@
           <w:b/>
           <w:bCs/>
           <w:color w:val="1F3864"/>
-          <w:sz w:val="36"/>
-          <w:szCs w:val="36"/>
+          <w:sz w:val="34"/>
+          <w:szCs w:val="34"/>
         </w:rPr>
         <w:t xml:space="preserve">Chapter 5 Exercise</w:t>
       </w:r>
@@ -55,7 +55,7 @@
         <w:spacing w:after="160" w:before="240"/>
       </w:pPr>
       <w:r>
-        <w:t xml:space="preserve">Part A: Comparing Three Certification Authorities</w:t>
+        <w:t xml:space="preserve">Part A: Comparing three certification authorities</w:t>
       </w:r>
     </w:p>
     <w:p>
@@ -64,20 +64,19 @@
       </w:pPr>
       <w:r>
         <w:rPr>
-          <w:rFonts w:ascii="Calibri" w:cs="Calibri" w:eastAsia="Calibri" w:hAnsi="Calibri"/>
-          <w:sz w:val="24"/>
-          <w:szCs w:val="24"/>
-        </w:rPr>
-        <w:t xml:space="preserve">Every time I see the little padlock next to a web address, a certification authority (CA) is working in the background. A CA is a trusted company that checks who owns a website and then issues a digital certificate proving it. That certificate lets the browser and the server set up an encrypted connection, so things like credit card numbers can't be read by someone snooping on the network. For this exercise I looked at three of the best-known CAs: DigiCert, Sectigo, and GlobalSign.</w:t>
+          <w:sz w:val="24"/>
+          <w:szCs w:val="24"/>
+        </w:rPr>
+        <w:t xml:space="preserve">Whenever you see the padlock next to a web address, a certification authority (CA) is behind it. A CA is a company that browsers trust to check who owns a website and then issue a digital certificate saying so. The certificate lets your browser and the site set up an encrypted connection, so a credit card number typed into a checkout page can't be read by someone in between. I picked three well-known CAs to compare: DigiCert, Sectigo, and GlobalSign.</w:t>
       </w:r>
     </w:p>
     <w:p>
       <w:pPr>
         <w:pStyle w:val="Heading2"/>
-        <w:spacing w:after="120" w:before="200"/>
-      </w:pPr>
-      <w:r>
-        <w:t xml:space="preserve">1. DigiCert</w:t>
+        <w:spacing w:after="120" w:before="240"/>
+      </w:pPr>
+      <w:r>
+        <w:t xml:space="preserve">DigiCert</w:t>
       </w:r>
     </w:p>
     <w:p>
@@ -86,72 +85,31 @@
       </w:pPr>
       <w:r>
         <w:rPr>
-          <w:rFonts w:ascii="Calibri" w:cs="Calibri" w:eastAsia="Calibri" w:hAnsi="Calibri"/>
-          <w:sz w:val="24"/>
-          <w:szCs w:val="24"/>
-        </w:rPr>
-        <w:t xml:space="preserve">DigiCert is based in Lehi, Utah, and was started in 2003. It grew a lot by buying other companies, most notably Symantec's website security business in 2017, which also brought in brands like GeoTrust, Thawte, and RapidSSL. Today DigiCert is usually considered the biggest name in high-assurance certificates. The company says it serves more than 100,000 customers, including most of the Fortune 500 and a large share of the world's top banks.</w:t>
-      </w:r>
-    </w:p>
-    <w:p>
-      <w:pPr>
-        <w:pStyle w:val="ListParagraph"/>
-        <w:numPr>
-          <w:ilvl w:val="0"/>
-          <w:numId w:val="2"/>
-        </w:numPr>
-        <w:spacing w:after="100" w:line="288"/>
-      </w:pPr>
-      <w:r>
-        <w:rPr>
-          <w:b/>
-          <w:bCs/>
-          <w:sz w:val="24"/>
-          <w:szCs w:val="24"/>
-        </w:rPr>
-        <w:t xml:space="preserve">What stands out: </w:t>
-      </w:r>
-      <w:r>
-        <w:rPr>
-          <w:sz w:val="24"/>
-          <w:szCs w:val="24"/>
-        </w:rPr>
-        <w:t xml:space="preserve">DigiCert is known for strict identity checks and fast customer support. Its CertCentral dashboard helps big companies keep track of thousands of certificates so none of them expire by surprise.</w:t>
-      </w:r>
-    </w:p>
-    <w:p>
-      <w:pPr>
-        <w:pStyle w:val="ListParagraph"/>
-        <w:numPr>
-          <w:ilvl w:val="0"/>
-          <w:numId w:val="2"/>
-        </w:numPr>
-        <w:spacing w:after="100" w:line="288"/>
-      </w:pPr>
-      <w:r>
-        <w:rPr>
-          <w:b/>
-          <w:bCs/>
-          <w:sz w:val="24"/>
-          <w:szCs w:val="24"/>
-        </w:rPr>
-        <w:t xml:space="preserve">Downside: </w:t>
-      </w:r>
-      <w:r>
-        <w:rPr>
-          <w:sz w:val="24"/>
-          <w:szCs w:val="24"/>
-        </w:rPr>
-        <w:t xml:space="preserve">It is the most expensive of the three, which can be a lot for a small online store.</w:t>
+          <w:sz w:val="24"/>
+          <w:szCs w:val="24"/>
+        </w:rPr>
+        <w:t xml:space="preserve">DigiCert started in 2003 and is based in Lehi, Utah. A lot of its size came from buying other companies. The biggest purchase was Symantec's website security business in 2017, which brought GeoTrust, Thawte, and RapidSSL along with it. DigiCert says it has more than 100,000 customers, including most of the Fortune 500.</w:t>
+      </w:r>
+    </w:p>
+    <w:p>
+      <w:pPr>
+        <w:spacing w:after="160" w:line="300"/>
+      </w:pPr>
+      <w:r>
+        <w:rPr>
+          <w:sz w:val="24"/>
+          <w:szCs w:val="24"/>
+        </w:rPr>
+        <w:t xml:space="preserve">Its certificates go through strict identity checks, and its customer support has a good reputation. Large companies like its CertCentral dashboard, which keeps track of thousands of certificates so none of them expire without warning. The catch is the price. DigiCert is the most expensive of the three, which is hard to justify for a small online shop.</w:t>
       </w:r>
     </w:p>
     <w:p>
       <w:pPr>
         <w:pStyle w:val="Heading2"/>
-        <w:spacing w:after="120" w:before="200"/>
-      </w:pPr>
-      <w:r>
-        <w:t xml:space="preserve">2. Sectigo</w:t>
+        <w:spacing w:after="120" w:before="240"/>
+      </w:pPr>
+      <w:r>
+        <w:t xml:space="preserve">Sectigo</w:t>
       </w:r>
     </w:p>
     <w:p>
@@ -160,72 +118,31 @@
       </w:pPr>
       <w:r>
         <w:rPr>
-          <w:rFonts w:ascii="Calibri" w:cs="Calibri" w:eastAsia="Calibri" w:hAnsi="Calibri"/>
-          <w:sz w:val="24"/>
-          <w:szCs w:val="24"/>
-        </w:rPr>
-        <w:t xml:space="preserve">Sectigo used to be called Comodo CA and changed its name in 2018. It is headquartered in Roseland, New Jersey. Sectigo has historically issued a huge number of certificates because its prices are low and it sells through a large network of web hosts and resellers. The company says it works with hundreds of thousands of businesses around the world, so if you have bought a cheap SSL certificate from a hosting company, there is a good chance it came from Sectigo.</w:t>
-      </w:r>
-    </w:p>
-    <w:p>
-      <w:pPr>
-        <w:pStyle w:val="ListParagraph"/>
-        <w:numPr>
-          <w:ilvl w:val="0"/>
-          <w:numId w:val="2"/>
-        </w:numPr>
-        <w:spacing w:after="100" w:line="288"/>
-      </w:pPr>
-      <w:r>
-        <w:rPr>
-          <w:b/>
-          <w:bCs/>
-          <w:sz w:val="24"/>
-          <w:szCs w:val="24"/>
-        </w:rPr>
-        <w:t xml:space="preserve">What stands out: </w:t>
-      </w:r>
-      <w:r>
-        <w:rPr>
-          <w:sz w:val="24"/>
-          <w:szCs w:val="24"/>
-        </w:rPr>
-        <w:t xml:space="preserve">Affordable prices, a wide product range (wildcard and multi-domain certificates), and good tools for automating renewals.</w:t>
-      </w:r>
-    </w:p>
-    <w:p>
-      <w:pPr>
-        <w:pStyle w:val="ListParagraph"/>
-        <w:numPr>
-          <w:ilvl w:val="0"/>
-          <w:numId w:val="2"/>
-        </w:numPr>
-        <w:spacing w:after="100" w:line="288"/>
-      </w:pPr>
-      <w:r>
-        <w:rPr>
-          <w:b/>
-          <w:bCs/>
-          <w:sz w:val="24"/>
-          <w:szCs w:val="24"/>
-        </w:rPr>
-        <w:t xml:space="preserve">Downside: </w:t>
-      </w:r>
-      <w:r>
-        <w:rPr>
-          <w:sz w:val="24"/>
-          <w:szCs w:val="24"/>
-        </w:rPr>
-        <w:t xml:space="preserve">Support can feel less personal than DigiCert, and its brand is less familiar to large enterprises.</w:t>
+          <w:sz w:val="24"/>
+          <w:szCs w:val="24"/>
+        </w:rPr>
+        <w:t xml:space="preserve">Sectigo was called Comodo CA until 2018, and it's headquartered in Roseland, New Jersey. Its strategy is volume. Prices are low, and it sells through a huge network of web hosts and resellers, so if you've ever bought a cheap SSL certificate from a hosting company, Sectigo probably issued it. The company says it works with hundreds of thousands of businesses.</w:t>
+      </w:r>
+    </w:p>
+    <w:p>
+      <w:pPr>
+        <w:spacing w:after="160" w:line="300"/>
+      </w:pPr>
+      <w:r>
+        <w:rPr>
+          <w:sz w:val="24"/>
+          <w:szCs w:val="24"/>
+        </w:rPr>
+        <w:t xml:space="preserve">You can get wildcard and multi-domain certificates from Sectigo, and its renewal automation works well. Support isn't as hands-on as DigiCert's, though, and big enterprises don't know the name as well.</w:t>
       </w:r>
     </w:p>
     <w:p>
       <w:pPr>
         <w:pStyle w:val="Heading2"/>
-        <w:spacing w:after="120" w:before="200"/>
-      </w:pPr>
-      <w:r>
-        <w:t xml:space="preserve">3. GlobalSign</w:t>
+        <w:spacing w:after="120" w:before="240"/>
+      </w:pPr>
+      <w:r>
+        <w:t xml:space="preserve">GlobalSign</w:t>
       </w:r>
     </w:p>
     <w:p>
@@ -234,72 +151,31 @@
       </w:pPr>
       <w:r>
         <w:rPr>
-          <w:rFonts w:ascii="Calibri" w:cs="Calibri" w:eastAsia="Calibri" w:hAnsi="Calibri"/>
-          <w:sz w:val="24"/>
-          <w:szCs w:val="24"/>
-        </w:rPr>
-        <w:t xml:space="preserve">GlobalSign was founded in Belgium in 1996, which makes it one of the oldest CAs still around. Since 2007 it has been owned by GMO Internet Group in Japan. It has offices across Europe, Asia, and the Americas, which makes it a natural choice for companies that sell internationally. GlobalSign serves tens of thousands of organizations and has issued many millions of certificates, and it is especially active in Internet of Things (IoT) devices and document signing.</w:t>
-      </w:r>
-    </w:p>
-    <w:p>
-      <w:pPr>
-        <w:pStyle w:val="ListParagraph"/>
-        <w:numPr>
-          <w:ilvl w:val="0"/>
-          <w:numId w:val="2"/>
-        </w:numPr>
-        <w:spacing w:after="100" w:line="288"/>
-      </w:pPr>
-      <w:r>
-        <w:rPr>
-          <w:b/>
-          <w:bCs/>
-          <w:sz w:val="24"/>
-          <w:szCs w:val="24"/>
-        </w:rPr>
-        <w:t xml:space="preserve">What stands out: </w:t>
-      </w:r>
-      <w:r>
-        <w:rPr>
-          <w:sz w:val="24"/>
-          <w:szCs w:val="24"/>
-        </w:rPr>
-        <w:t xml:space="preserve">Strong global presence, good support for European rules such as eIDAS, and a cloud-based Atlas platform for issuing certificates at scale.</w:t>
-      </w:r>
-    </w:p>
-    <w:p>
-      <w:pPr>
-        <w:pStyle w:val="ListParagraph"/>
-        <w:numPr>
-          <w:ilvl w:val="0"/>
-          <w:numId w:val="2"/>
-        </w:numPr>
-        <w:spacing w:after="100" w:line="288"/>
-      </w:pPr>
-      <w:r>
-        <w:rPr>
-          <w:b/>
-          <w:bCs/>
-          <w:sz w:val="24"/>
-          <w:szCs w:val="24"/>
-        </w:rPr>
-        <w:t xml:space="preserve">Downside: </w:t>
-      </w:r>
-      <w:r>
-        <w:rPr>
-          <w:sz w:val="24"/>
-          <w:szCs w:val="24"/>
-        </w:rPr>
-        <w:t xml:space="preserve">Prices sit in the middle to upper range, and its products can be a bit complicated for a first-time buyer.</w:t>
+          <w:sz w:val="24"/>
+          <w:szCs w:val="24"/>
+        </w:rPr>
+        <w:t xml:space="preserve">GlobalSign was founded in Belgium in 1996, which makes it one of the oldest CAs still operating. GMO Internet Group in Japan has owned it since 2007, and it has offices in Europe, Asia, and the Americas. Because of that, it's a good fit for companies that sell in several countries. It serves tens of thousands of organizations, has issued millions of certificates, and does a lot of work with IoT devices and document signing. It also handles European rules like eIDAS well.</w:t>
+      </w:r>
+    </w:p>
+    <w:p>
+      <w:pPr>
+        <w:spacing w:after="160" w:line="300"/>
+      </w:pPr>
+      <w:r>
+        <w:rPr>
+          <w:sz w:val="24"/>
+          <w:szCs w:val="24"/>
+        </w:rPr>
+        <w:t xml:space="preserve">Its prices are in the middle to upper range, and a first-time buyer might find the product list confusing.</w:t>
       </w:r>
     </w:p>
     <w:p>
       <w:pPr>
         <w:pStyle w:val="Heading2"/>
-        <w:spacing w:after="120" w:before="200"/>
-      </w:pPr>
-      <w:r>
-        <w:t xml:space="preserve">Side-by-Side Comparison</w:t>
+        <w:spacing w:after="120" w:before="240"/>
+      </w:pPr>
+      <w:r>
+        <w:t xml:space="preserve">Side-by-side comparison</w:t>
       </w:r>
     </w:p>
     <w:tbl>
@@ -422,10 +298,13 @@
         </w:tc>
       </w:tr>
       <w:tr>
+        <w:trPr>
+          <w:tblHeader w:val="false"/>
+        </w:trPr>
         <w:tc>
           <w:tcPr>
             <w:tcW w:type="dxa" w:w="2200"/>
-            <w:shd w:fill="E8EEF7" w:color="auto" w:val="clear"/>
+            <w:shd w:fill="F2F2F2" w:color="auto" w:val="clear"/>
             <w:tcMar>
               <w:top w:type="dxa" w:w="80"/>
               <w:left w:type="dxa" w:w="100"/>
@@ -517,10 +396,13 @@
         </w:tc>
       </w:tr>
       <w:tr>
+        <w:trPr>
+          <w:tblHeader w:val="false"/>
+        </w:trPr>
         <w:tc>
           <w:tcPr>
             <w:tcW w:type="dxa" w:w="2200"/>
-            <w:shd w:fill="E8EEF7" w:color="auto" w:val="clear"/>
+            <w:shd w:fill="F2F2F2" w:color="auto" w:val="clear"/>
             <w:tcMar>
               <w:top w:type="dxa" w:w="80"/>
               <w:left w:type="dxa" w:w="100"/>
@@ -612,10 +494,13 @@
         </w:tc>
       </w:tr>
       <w:tr>
+        <w:trPr>
+          <w:tblHeader w:val="false"/>
+        </w:trPr>
         <w:tc>
           <w:tcPr>
             <w:tcW w:type="dxa" w:w="2200"/>
-            <w:shd w:fill="E8EEF7" w:color="auto" w:val="clear"/>
+            <w:shd w:fill="F2F2F2" w:color="auto" w:val="clear"/>
             <w:tcMar>
               <w:top w:type="dxa" w:w="80"/>
               <w:left w:type="dxa" w:w="100"/>
@@ -678,7 +563,7 @@
                 <w:sz w:val="20"/>
                 <w:szCs w:val="20"/>
               </w:rPr>
-              <w:t xml:space="preserve">Hundreds of thousands of businesses worldwide</w:t>
+              <w:t xml:space="preserve">Hundreds of thousands of businesses</w:t>
             </w:r>
           </w:p>
         </w:tc>
@@ -707,10 +592,13 @@
         </w:tc>
       </w:tr>
       <w:tr>
+        <w:trPr>
+          <w:tblHeader w:val="false"/>
+        </w:trPr>
         <w:tc>
           <w:tcPr>
             <w:tcW w:type="dxa" w:w="2200"/>
-            <w:shd w:fill="E8EEF7" w:color="auto" w:val="clear"/>
+            <w:shd w:fill="F2F2F2" w:color="auto" w:val="clear"/>
             <w:tcMar>
               <w:top w:type="dxa" w:w="80"/>
               <w:left w:type="dxa" w:w="100"/>
@@ -750,7 +638,7 @@
                 <w:sz w:val="20"/>
                 <w:szCs w:val="20"/>
               </w:rPr>
-              <w:t xml:space="preserve">DV, OV, EV SSL/TLS; code signing; document signing; S/MIME email; IoT</w:t>
+              <w:t xml:space="preserve">DV, OV, EV SSL/TLS; code signing; document signing; S/MIME; IoT</w:t>
             </w:r>
           </w:p>
         </w:tc>
@@ -802,10 +690,13 @@
         </w:tc>
       </w:tr>
       <w:tr>
+        <w:trPr>
+          <w:tblHeader w:val="false"/>
+        </w:trPr>
         <w:tc>
           <w:tcPr>
             <w:tcW w:type="dxa" w:w="2200"/>
-            <w:shd w:fill="E8EEF7" w:color="auto" w:val="clear"/>
+            <w:shd w:fill="F2F2F2" w:color="auto" w:val="clear"/>
             <w:tcMar>
               <w:top w:type="dxa" w:w="80"/>
               <w:left w:type="dxa" w:w="100"/>
@@ -845,7 +736,7 @@
                 <w:sz w:val="20"/>
                 <w:szCs w:val="20"/>
               </w:rPr>
-              <w:t xml:space="preserve">Premium (highest of the three)</w:t>
+              <w:t xml:space="preserve">Highest of the three</w:t>
             </w:r>
           </w:p>
         </w:tc>
@@ -897,10 +788,13 @@
         </w:tc>
       </w:tr>
       <w:tr>
+        <w:trPr>
+          <w:tblHeader w:val="false"/>
+        </w:trPr>
         <w:tc>
           <w:tcPr>
             <w:tcW w:type="dxa" w:w="2200"/>
-            <w:shd w:fill="E8EEF7" w:color="auto" w:val="clear"/>
+            <w:shd w:fill="F2F2F2" w:color="auto" w:val="clear"/>
             <w:tcMar>
               <w:top w:type="dxa" w:w="80"/>
               <w:left w:type="dxa" w:w="100"/>
@@ -940,7 +834,7 @@
                 <w:sz w:val="20"/>
                 <w:szCs w:val="20"/>
               </w:rPr>
-              <w:t xml:space="preserve">Up to about $2 million (Secure Site Pro)</w:t>
+              <w:t xml:space="preserve">Up to about $2 million</w:t>
             </w:r>
           </w:p>
         </w:tc>
@@ -992,10 +886,13 @@
         </w:tc>
       </w:tr>
       <w:tr>
+        <w:trPr>
+          <w:tblHeader w:val="false"/>
+        </w:trPr>
         <w:tc>
           <w:tcPr>
             <w:tcW w:type="dxa" w:w="2200"/>
-            <w:shd w:fill="E8EEF7" w:color="auto" w:val="clear"/>
+            <w:shd w:fill="F2F2F2" w:color="auto" w:val="clear"/>
             <w:tcMar>
               <w:top w:type="dxa" w:w="80"/>
               <w:left w:type="dxa" w:w="100"/>
@@ -1035,7 +932,7 @@
                 <w:sz w:val="20"/>
                 <w:szCs w:val="20"/>
               </w:rPr>
-              <w:t xml:space="preserve">CertCentral and Trust Lifeline automation</w:t>
+              <w:t xml:space="preserve">CertCentral, Trust Lifeline</w:t>
             </w:r>
           </w:p>
         </w:tc>
@@ -1058,7 +955,7 @@
                 <w:sz w:val="20"/>
                 <w:szCs w:val="20"/>
               </w:rPr>
-              <w:t xml:space="preserve">Sectigo Certificate Manager (CLM)</w:t>
+              <w:t xml:space="preserve">Sectigo Certificate Manager</w:t>
             </w:r>
           </w:p>
         </w:tc>
@@ -1081,16 +978,19 @@
                 <w:sz w:val="20"/>
                 <w:szCs w:val="20"/>
               </w:rPr>
-              <w:t xml:space="preserve">Atlas platform and Auto Enrollment Gateway</w:t>
+              <w:t xml:space="preserve">Atlas, Auto Enrollment Gateway</w:t>
             </w:r>
           </w:p>
         </w:tc>
       </w:tr>
       <w:tr>
+        <w:trPr>
+          <w:tblHeader w:val="false"/>
+        </w:trPr>
         <w:tc>
           <w:tcPr>
             <w:tcW w:type="dxa" w:w="2200"/>
-            <w:shd w:fill="E8EEF7" w:color="auto" w:val="clear"/>
+            <w:shd w:fill="F2F2F2" w:color="auto" w:val="clear"/>
             <w:tcMar>
               <w:top w:type="dxa" w:w="80"/>
               <w:left w:type="dxa" w:w="100"/>
@@ -1153,7 +1053,7 @@
                 <w:sz w:val="20"/>
                 <w:szCs w:val="20"/>
               </w:rPr>
-              <w:t xml:space="preserve">Small businesses and price-conscious buyers</w:t>
+              <w:t xml:space="preserve">Small businesses on a budget</w:t>
             </w:r>
           </w:p>
         </w:tc>
@@ -1176,7 +1076,7 @@
                 <w:sz w:val="20"/>
                 <w:szCs w:val="20"/>
               </w:rPr>
-              <w:t xml:space="preserve">Mid-size firms, international companies, IoT</w:t>
+              <w:t xml:space="preserve">Mid-size and international companies, IoT</w:t>
             </w:r>
           </w:p>
         </w:tc>
@@ -1184,7 +1084,7 @@
     </w:tbl>
     <w:p>
       <w:pPr>
-        <w:spacing w:after="200" w:before="80"/>
+        <w:spacing w:after="200" w:before="60"/>
       </w:pPr>
       <w:r>
         <w:rPr>
@@ -1193,16 +1093,16 @@
           <w:sz w:val="18"/>
           <w:szCs w:val="18"/>
         </w:rPr>
-        <w:t xml:space="preserve">Note: Client numbers and warranty amounts are approximate figures published by each company and change over time.</w:t>
+        <w:t xml:space="preserve">Client numbers and warranty amounts are approximate figures published by each company and change over time.</w:t>
       </w:r>
     </w:p>
     <w:p>
       <w:pPr>
         <w:pStyle w:val="Heading2"/>
-        <w:spacing w:after="120" w:before="200"/>
-      </w:pPr>
-      <w:r>
-        <w:t xml:space="preserve">What All Three Have in Common</w:t>
+        <w:spacing w:after="120" w:before="240"/>
+      </w:pPr>
+      <w:r>
+        <w:t xml:space="preserve">How they compare</w:t>
       </w:r>
     </w:p>
     <w:p>
@@ -1211,11 +1111,10 @@
       </w:pPr>
       <w:r>
         <w:rPr>
-          <w:rFonts w:ascii="Calibri" w:cs="Calibri" w:eastAsia="Calibri" w:hAnsi="Calibri"/>
-          <w:sz w:val="24"/>
-          <w:szCs w:val="24"/>
-        </w:rPr>
-        <w:t xml:space="preserve">All three offer the same three validation levels. Domain Validation (DV) only proves you control the domain and is issued in minutes. Organization Validation (OV) also checks that the business is real. Extended Validation (EV) involves the most paperwork and is meant for banks and big retailers. All three are also trusted by every major browser, so a visitor will not notice much difference in the padlock itself. The real differences come down to price, support, warranty, and management tools.</w:t>
+          <w:sz w:val="24"/>
+          <w:szCs w:val="24"/>
+        </w:rPr>
+        <w:t xml:space="preserve">What you actually get from the three is closer than their prices suggest. All of them sell the same three validation levels. Domain Validation (DV) only proves you control the domain and takes a few minutes. Organization Validation (OV) also confirms the business exists. Extended Validation (EV) involves the most paperwork and is aimed at banks and big retailers. Every major browser trusts all three companies, so a visitor won't see any difference in the padlock. You're really choosing between price, support, warranty, and management tools.</w:t>
       </w:r>
     </w:p>
     <w:p>
@@ -1224,20 +1123,31 @@
       </w:pPr>
       <w:r>
         <w:rPr>
-          <w:rFonts w:ascii="Calibri" w:cs="Calibri" w:eastAsia="Calibri" w:hAnsi="Calibri"/>
-          <w:sz w:val="24"/>
-          <w:szCs w:val="24"/>
-        </w:rPr>
-        <w:t xml:space="preserve">One more thing worth knowing: certificate lifetimes are getting shorter. The industry group that sets the rules (the CA/Browser Forum) cut the maximum lifespan to 200 days in March 2026, with further cuts planned until it reaches 47 days in 2029. That is why automation tools have become such a big selling point for all three companies. It is also why free, fully automated options like Let's Encrypt, which now protects hundreds of millions of websites, have become so popular with small sites.</w:t>
+          <w:sz w:val="24"/>
+          <w:szCs w:val="24"/>
+        </w:rPr>
+        <w:t xml:space="preserve">Certificates also don't last as long as they used to. The CA/Browser Forum, the group that sets the rules, cut the maximum lifespan to 200 days in March 2026 and plans to keep cutting it until it reaches 47 days in 2029. Nobody wants to renew that often by hand, which is why all three companies push their automation tools. It's also why many small sites use Let's Encrypt, a free nonprofit CA that automates the whole process and now covers hundreds of millions of websites.</w:t>
+      </w:r>
+    </w:p>
+    <w:p>
+      <w:pPr>
+        <w:spacing w:after="160" w:line="300"/>
+      </w:pPr>
+      <w:r>
+        <w:rPr>
+          <w:sz w:val="24"/>
+          <w:szCs w:val="24"/>
+        </w:rPr>
+        <w:t xml:space="preserve">If I ran a small online store, I'd go with Sectigo or even Let's Encrypt. A bank or a large retailer should probably pay for DigiCert.</w:t>
       </w:r>
     </w:p>
     <w:p>
       <w:pPr>
         <w:pStyle w:val="Heading2"/>
-        <w:spacing w:after="120" w:before="200"/>
-      </w:pPr>
-      <w:r>
-        <w:t xml:space="preserve">Presentation Summary (Part A)</w:t>
+        <w:spacing w:after="120" w:before="240"/>
+      </w:pPr>
+      <w:r>
+        <w:t xml:space="preserve">Key points for the presentation</w:t>
       </w:r>
     </w:p>
     <w:p>
@@ -1247,14 +1157,14 @@
           <w:ilvl w:val="0"/>
           <w:numId w:val="2"/>
         </w:numPr>
-        <w:spacing w:after="100" w:line="288"/>
-      </w:pPr>
-      <w:r>
-        <w:rPr>
-          <w:sz w:val="24"/>
-          <w:szCs w:val="24"/>
-        </w:rPr>
-        <w:t xml:space="preserve">A CA verifies identity and issues the certificate behind the padlock and HTTPS.</w:t>
+        <w:spacing w:after="80" w:line="288"/>
+      </w:pPr>
+      <w:r>
+        <w:rPr>
+          <w:sz w:val="24"/>
+          <w:szCs w:val="24"/>
+        </w:rPr>
+        <w:t xml:space="preserve">A CA checks a website's identity and issues the certificate behind HTTPS and the padlock.</w:t>
       </w:r>
     </w:p>
     <w:p>
@@ -1264,14 +1174,14 @@
           <w:ilvl w:val="0"/>
           <w:numId w:val="2"/>
         </w:numPr>
-        <w:spacing w:after="100" w:line="288"/>
-      </w:pPr>
-      <w:r>
-        <w:rPr>
-          <w:sz w:val="24"/>
-          <w:szCs w:val="24"/>
-        </w:rPr>
-        <w:t xml:space="preserve">DigiCert: premium, enterprise-focused, 100,000+ customers, best support.</w:t>
+        <w:spacing w:after="80" w:line="288"/>
+      </w:pPr>
+      <w:r>
+        <w:rPr>
+          <w:sz w:val="24"/>
+          <w:szCs w:val="24"/>
+        </w:rPr>
+        <w:t xml:space="preserve">DigiCert is the premium, enterprise choice with 100,000+ customers.</w:t>
       </w:r>
     </w:p>
     <w:p>
@@ -1281,14 +1191,14 @@
           <w:ilvl w:val="0"/>
           <w:numId w:val="2"/>
         </w:numPr>
-        <w:spacing w:after="100" w:line="288"/>
-      </w:pPr>
-      <w:r>
-        <w:rPr>
-          <w:sz w:val="24"/>
-          <w:szCs w:val="24"/>
-        </w:rPr>
-        <w:t xml:space="preserve">Sectigo: budget-friendly, sold through many web hosts, huge volume of certificates.</w:t>
+        <w:spacing w:after="80" w:line="288"/>
+      </w:pPr>
+      <w:r>
+        <w:rPr>
+          <w:sz w:val="24"/>
+          <w:szCs w:val="24"/>
+        </w:rPr>
+        <w:t xml:space="preserve">Sectigo is cheap, sold through web hosts, and issues a huge number of certificates.</w:t>
       </w:r>
     </w:p>
     <w:p>
@@ -1298,14 +1208,14 @@
           <w:ilvl w:val="0"/>
           <w:numId w:val="2"/>
         </w:numPr>
-        <w:spacing w:after="100" w:line="288"/>
-      </w:pPr>
-      <w:r>
-        <w:rPr>
-          <w:sz w:val="24"/>
-          <w:szCs w:val="24"/>
-        </w:rPr>
-        <w:t xml:space="preserve">GlobalSign: oldest of the three, strong international and IoT focus.</w:t>
+        <w:spacing w:after="80" w:line="288"/>
+      </w:pPr>
+      <w:r>
+        <w:rPr>
+          <w:sz w:val="24"/>
+          <w:szCs w:val="24"/>
+        </w:rPr>
+        <w:t xml:space="preserve">GlobalSign is the oldest of the three and strongest overseas and in IoT.</w:t>
       </w:r>
     </w:p>
     <w:p>
@@ -1315,14 +1225,14 @@
           <w:ilvl w:val="0"/>
           <w:numId w:val="2"/>
         </w:numPr>
-        <w:spacing w:after="100" w:line="288"/>
-      </w:pPr>
-      <w:r>
-        <w:rPr>
-          <w:sz w:val="24"/>
-          <w:szCs w:val="24"/>
-        </w:rPr>
-        <w:t xml:space="preserve">My pick: a small store would do fine with Sectigo, while a bank or large retailer should pay for DigiCert.</w:t>
+        <w:spacing w:after="80" w:line="288"/>
+      </w:pPr>
+      <w:r>
+        <w:rPr>
+          <w:sz w:val="24"/>
+          <w:szCs w:val="24"/>
+        </w:rPr>
+        <w:t xml:space="preserve">All three offer DV, OV, and EV certificates, and browsers trust them equally.</w:t>
       </w:r>
     </w:p>
     <w:p>
@@ -1331,7 +1241,7 @@
         <w:spacing w:after="160" w:before="240"/>
       </w:pPr>
       <w:r>
-        <w:t xml:space="preserve">Part B: Challenges of Payments Across International Borders</w:t>
+        <w:t xml:space="preserve">Part B: Payments across international borders</w:t>
       </w:r>
     </w:p>
     <w:p>
@@ -1340,20 +1250,19 @@
       </w:pPr>
       <w:r>
         <w:rPr>
-          <w:rFonts w:ascii="Calibri" w:cs="Calibri" w:eastAsia="Calibri" w:hAnsi="Calibri"/>
-          <w:sz w:val="24"/>
-          <w:szCs w:val="24"/>
-        </w:rPr>
-        <w:t xml:space="preserve">Selling online makes it feel like the whole world is your market. In practice, taking money from someone in another country is a lot messier than taking it from someone down the street. Here is what I found.</w:t>
+          <w:sz w:val="24"/>
+          <w:szCs w:val="24"/>
+        </w:rPr>
+        <w:t xml:space="preserve">Selling online makes it look like anyone in the world can be your customer. Actually getting paid by someone in another country is harder than it sounds.</w:t>
       </w:r>
     </w:p>
     <w:p>
       <w:pPr>
         <w:pStyle w:val="Heading2"/>
-        <w:spacing w:after="120" w:before="200"/>
-      </w:pPr>
-      <w:r>
-        <w:t xml:space="preserve">Do Most E-Commerce Companies Sell Internationally?</w:t>
+        <w:spacing w:after="120" w:before="240"/>
+      </w:pPr>
+      <w:r>
+        <w:t xml:space="preserve">Do most e-commerce companies sell internationally?</w:t>
       </w:r>
     </w:p>
     <w:p>
@@ -1362,20 +1271,76 @@
       </w:pPr>
       <w:r>
         <w:rPr>
-          <w:rFonts w:ascii="Calibri" w:cs="Calibri" w:eastAsia="Calibri" w:hAnsi="Calibri"/>
-          <w:sz w:val="24"/>
-          <w:szCs w:val="24"/>
-        </w:rPr>
-        <w:t xml:space="preserve">Many do, but not all of them do it well. Giants like Amazon, eBay, Shein, and Temu sell in dozens of countries, and platforms like Shopify make it easy for small businesses to accept foreign orders. Cross-border e-commerce is now a trillion-dollar market and keeps growing every year. Still, plenty of smaller U.S. sellers either ship only within the country or ship to a handful of nearby countries like Canada, because of the costs, fraud risk, and paperwork involved.</w:t>
+          <w:sz w:val="24"/>
+          <w:szCs w:val="24"/>
+        </w:rPr>
+        <w:t xml:space="preserve">A lot of them do, though not always well. Amazon, eBay, Shein, and Temu sell in dozens of countries, and Shopify makes it fairly easy for a small business to accept foreign orders. Cross-border e-commerce is worth over a trillion dollars a year and is still growing. Plenty of smaller U.S. sellers, though, ship only within the country or to a few nearby places like Canada. For them, the costs, fraud risk, and paperwork aren't worth it.</w:t>
       </w:r>
     </w:p>
     <w:p>
       <w:pPr>
         <w:pStyle w:val="Heading2"/>
-        <w:spacing w:after="120" w:before="200"/>
-      </w:pPr>
-      <w:r>
-        <w:t xml:space="preserve">The Main Challenges</w:t>
+        <w:spacing w:after="120" w:before="240"/>
+      </w:pPr>
+      <w:r>
+        <w:t xml:space="preserve">The main challenges</w:t>
+      </w:r>
+    </w:p>
+    <w:p>
+      <w:pPr>
+        <w:spacing w:after="160" w:line="300"/>
+      </w:pPr>
+      <w:r>
+        <w:rPr>
+          <w:sz w:val="24"/>
+          <w:szCs w:val="24"/>
+        </w:rPr>
+        <w:t xml:space="preserve">The first problem is that people pay differently around the world. Americans mostly use credit cards. In the Netherlands people use iDEAL, in China it's Alipay and WeChat Pay, Brazilians use Pix, and many Germans prefer bank transfers. A store that only takes Visa and Mastercard loses those shoppers at checkout.</w:t>
+      </w:r>
+    </w:p>
+    <w:p>
+      <w:pPr>
+        <w:spacing w:after="160" w:line="300"/>
+      </w:pPr>
+      <w:r>
+        <w:rPr>
+          <w:sz w:val="24"/>
+          <w:szCs w:val="24"/>
+        </w:rPr>
+        <w:t xml:space="preserve">Fees are higher too. Payment processors usually add 1% to 2% for international cards, plus a currency conversion charge. Fraud is more common on foreign orders, and it's harder to check whether an overseas address or phone number is real.</w:t>
+      </w:r>
+    </w:p>
+    <w:p>
+      <w:pPr>
+        <w:spacing w:after="160" w:line="300"/>
+      </w:pPr>
+      <w:r>
+        <w:rPr>
+          <w:sz w:val="24"/>
+          <w:szCs w:val="24"/>
+        </w:rPr>
+        <w:t xml:space="preserve">Then there are the rules. Europe requires an extra security step called Strong Customer Authentication under PSD2, and the GDPR controls how customer data is stored. Some countries are under U.S. sanctions and can't be sold to at all. Most countries also charge VAT or GST on imports, plus customs duties, and someone has to collect and pay them.</w:t>
+      </w:r>
+    </w:p>
+    <w:p>
+      <w:pPr>
+        <w:pStyle w:val="Heading2"/>
+        <w:spacing w:after="120" w:before="240"/>
+      </w:pPr>
+      <w:r>
+        <w:t xml:space="preserve">How do companies protect themselves from repudiation?</w:t>
+      </w:r>
+    </w:p>
+    <w:p>
+      <w:pPr>
+        <w:spacing w:after="160" w:line="300"/>
+      </w:pPr>
+      <w:r>
+        <w:rPr>
+          <w:sz w:val="24"/>
+          <w:szCs w:val="24"/>
+        </w:rPr>
+        <w:t xml:space="preserve">Repudiation is when a customer denies making a purchase or says the item never arrived, usually by filing a chargeback with their bank. It's a bigger risk with foreign orders because it's hard to fight a dispute from another country. Merchants protect themselves in several ways:</w:t>
       </w:r>
     </w:p>
     <w:p>
@@ -1385,23 +1350,14 @@
           <w:ilvl w:val="0"/>
           <w:numId w:val="2"/>
         </w:numPr>
-        <w:spacing w:after="100" w:line="288"/>
-      </w:pPr>
-      <w:r>
-        <w:rPr>
-          <w:b/>
-          <w:bCs/>
-          <w:sz w:val="24"/>
-          <w:szCs w:val="24"/>
-        </w:rPr>
-        <w:t xml:space="preserve">Different payment habits: </w:t>
-      </w:r>
-      <w:r>
-        <w:rPr>
-          <w:sz w:val="24"/>
-          <w:szCs w:val="24"/>
-        </w:rPr>
-        <w:t xml:space="preserve">Americans mostly use credit cards, but shoppers in other countries often prefer something else, such as iDEAL in the Netherlands, Alipay and WeChat Pay in China, Pix in Brazil, or bank transfers in Germany. If a store only accepts Visa and Mastercard, it loses those customers at checkout.</w:t>
+        <w:spacing w:after="80" w:line="288"/>
+      </w:pPr>
+      <w:r>
+        <w:rPr>
+          <w:sz w:val="24"/>
+          <w:szCs w:val="24"/>
+        </w:rPr>
+        <w:t xml:space="preserve">3-D Secure (Visa Secure, Mastercard Identity Check) has the buyer confirm the purchase with their bank. If the bank approves it, the merchant usually isn't liable for fraud.</w:t>
       </w:r>
     </w:p>
     <w:p>
@@ -1411,23 +1367,14 @@
           <w:ilvl w:val="0"/>
           <w:numId w:val="2"/>
         </w:numPr>
-        <w:spacing w:after="100" w:line="288"/>
-      </w:pPr>
-      <w:r>
-        <w:rPr>
-          <w:b/>
-          <w:bCs/>
-          <w:sz w:val="24"/>
-          <w:szCs w:val="24"/>
-        </w:rPr>
-        <w:t xml:space="preserve">Higher fees: </w:t>
-      </w:r>
-      <w:r>
-        <w:rPr>
-          <w:sz w:val="24"/>
-          <w:szCs w:val="24"/>
-        </w:rPr>
-        <w:t xml:space="preserve">Payment processors usually charge an extra 1% to 2% for international cards, plus currency conversion fees.</w:t>
+        <w:spacing w:after="80" w:line="288"/>
+      </w:pPr>
+      <w:r>
+        <w:rPr>
+          <w:sz w:val="24"/>
+          <w:szCs w:val="24"/>
+        </w:rPr>
+        <w:t xml:space="preserve">Address Verification Service (AVS) and CVV checks make sure the card details match the buyer.</w:t>
       </w:r>
     </w:p>
     <w:p>
@@ -1437,23 +1384,14 @@
           <w:ilvl w:val="0"/>
           <w:numId w:val="2"/>
         </w:numPr>
-        <w:spacing w:after="100" w:line="288"/>
-      </w:pPr>
-      <w:r>
-        <w:rPr>
-          <w:b/>
-          <w:bCs/>
-          <w:sz w:val="24"/>
-          <w:szCs w:val="24"/>
-        </w:rPr>
-        <w:t xml:space="preserve">More fraud: </w:t>
-      </w:r>
-      <w:r>
-        <w:rPr>
-          <w:sz w:val="24"/>
-          <w:szCs w:val="24"/>
-        </w:rPr>
-        <w:t xml:space="preserve">International orders are flagged for fraud more often, and it is harder to verify a foreign address or phone number.</w:t>
+        <w:spacing w:after="80" w:line="288"/>
+      </w:pPr>
+      <w:r>
+        <w:rPr>
+          <w:sz w:val="24"/>
+          <w:szCs w:val="24"/>
+        </w:rPr>
+        <w:t xml:space="preserve">Fraud-screening tools like Stripe Radar or Signifyd give each order a risk score.</w:t>
       </w:r>
     </w:p>
     <w:p>
@@ -1463,23 +1401,14 @@
           <w:ilvl w:val="0"/>
           <w:numId w:val="2"/>
         </w:numPr>
-        <w:spacing w:after="100" w:line="288"/>
-      </w:pPr>
-      <w:r>
-        <w:rPr>
-          <w:b/>
-          <w:bCs/>
-          <w:sz w:val="24"/>
-          <w:szCs w:val="24"/>
-        </w:rPr>
-        <w:t xml:space="preserve">Laws and regulations: </w:t>
-      </w:r>
-      <w:r>
-        <w:rPr>
-          <w:sz w:val="24"/>
-          <w:szCs w:val="24"/>
-        </w:rPr>
-        <w:t xml:space="preserve">Europe requires Strong Customer Authentication (an extra security step) under PSD2, and data privacy laws like the GDPR control how customer information is stored. Some countries are under U.S. sanctions and cannot be sold to at all.</w:t>
+        <w:spacing w:after="80" w:line="288"/>
+      </w:pPr>
+      <w:r>
+        <w:rPr>
+          <w:sz w:val="24"/>
+          <w:szCs w:val="24"/>
+        </w:rPr>
+        <w:t xml:space="preserve">Tracked shipping with a signature on delivery proves the package arrived.</w:t>
       </w:r>
     </w:p>
     <w:p>
@@ -1489,45 +1418,14 @@
           <w:ilvl w:val="0"/>
           <w:numId w:val="2"/>
         </w:numPr>
-        <w:spacing w:after="100" w:line="288"/>
-      </w:pPr>
-      <w:r>
-        <w:rPr>
-          <w:b/>
-          <w:bCs/>
-          <w:sz w:val="24"/>
-          <w:szCs w:val="24"/>
-        </w:rPr>
-        <w:t xml:space="preserve">Taxes and duties: </w:t>
-      </w:r>
-      <w:r>
-        <w:rPr>
-          <w:sz w:val="24"/>
-          <w:szCs w:val="24"/>
-        </w:rPr>
-        <w:t xml:space="preserve">Many countries charge VAT or GST on imported goods, plus customs duties. Someone has to collect and pay these.</w:t>
-      </w:r>
-    </w:p>
-    <w:p>
-      <w:pPr>
-        <w:pStyle w:val="Heading2"/>
-        <w:spacing w:after="120" w:before="200"/>
-      </w:pPr>
-      <w:r>
-        <w:t xml:space="preserve">How Do They Protect Themselves From Repudiation?</w:t>
-      </w:r>
-    </w:p>
-    <w:p>
-      <w:pPr>
-        <w:spacing w:after="160" w:line="300"/>
-      </w:pPr>
-      <w:r>
-        <w:rPr>
-          <w:rFonts w:ascii="Calibri" w:cs="Calibri" w:eastAsia="Calibri" w:hAnsi="Calibri"/>
-          <w:sz w:val="24"/>
-          <w:szCs w:val="24"/>
-        </w:rPr>
-        <w:t xml:space="preserve">Repudiation is when a customer denies making a purchase or claims they never got the item, usually by filing a chargeback with their bank. This is a bigger risk with international orders because it is harder for the merchant to fight the claim from far away. Companies protect themselves in several ways:</w:t>
+        <w:spacing w:after="80" w:line="288"/>
+      </w:pPr>
+      <w:r>
+        <w:rPr>
+          <w:sz w:val="24"/>
+          <w:szCs w:val="24"/>
+        </w:rPr>
+        <w:t xml:space="preserve">Records like IP addresses, confirmation emails, and digital signatures give the merchant evidence if there's a dispute.</w:t>
       </w:r>
     </w:p>
     <w:p>
@@ -1537,108 +1435,23 @@
           <w:ilvl w:val="0"/>
           <w:numId w:val="2"/>
         </w:numPr>
-        <w:spacing w:after="100" w:line="288"/>
-      </w:pPr>
-      <w:r>
-        <w:rPr>
-          <w:sz w:val="24"/>
-          <w:szCs w:val="24"/>
-        </w:rPr>
-        <w:t xml:space="preserve">Using 3-D Secure (Visa Secure, Mastercard Identity Check), which asks the buyer to confirm the purchase with their bank. If the bank approves it, the liability for fraud usually shifts away from the merchant.</w:t>
-      </w:r>
-    </w:p>
-    <w:p>
-      <w:pPr>
-        <w:pStyle w:val="ListParagraph"/>
-        <w:numPr>
-          <w:ilvl w:val="0"/>
-          <w:numId w:val="2"/>
-        </w:numPr>
-        <w:spacing w:after="100" w:line="288"/>
-      </w:pPr>
-      <w:r>
-        <w:rPr>
-          <w:sz w:val="24"/>
-          <w:szCs w:val="24"/>
-        </w:rPr>
-        <w:t xml:space="preserve">Address Verification Service (AVS) and CVV checks to make sure the card details match the person.</w:t>
-      </w:r>
-    </w:p>
-    <w:p>
-      <w:pPr>
-        <w:pStyle w:val="ListParagraph"/>
-        <w:numPr>
-          <w:ilvl w:val="0"/>
-          <w:numId w:val="2"/>
-        </w:numPr>
-        <w:spacing w:after="100" w:line="288"/>
-      </w:pPr>
-      <w:r>
-        <w:rPr>
-          <w:sz w:val="24"/>
-          <w:szCs w:val="24"/>
-        </w:rPr>
-        <w:t xml:space="preserve">Fraud-screening tools like Stripe Radar or Signifyd that score each order for risk.</w:t>
-      </w:r>
-    </w:p>
-    <w:p>
-      <w:pPr>
-        <w:pStyle w:val="ListParagraph"/>
-        <w:numPr>
-          <w:ilvl w:val="0"/>
-          <w:numId w:val="2"/>
-        </w:numPr>
-        <w:spacing w:after="100" w:line="288"/>
-      </w:pPr>
-      <w:r>
-        <w:rPr>
-          <w:sz w:val="24"/>
-          <w:szCs w:val="24"/>
-        </w:rPr>
-        <w:t xml:space="preserve">Shipping with tracking and requiring a signature on delivery, so there is proof the package arrived.</w:t>
-      </w:r>
-    </w:p>
-    <w:p>
-      <w:pPr>
-        <w:pStyle w:val="ListParagraph"/>
-        <w:numPr>
-          <w:ilvl w:val="0"/>
-          <w:numId w:val="2"/>
-        </w:numPr>
-        <w:spacing w:after="100" w:line="288"/>
-      </w:pPr>
-      <w:r>
-        <w:rPr>
-          <w:sz w:val="24"/>
-          <w:szCs w:val="24"/>
-        </w:rPr>
-        <w:t xml:space="preserve">Keeping detailed records such as IP addresses, order confirmation emails, and digital signatures, which support non-repudiation if there is a dispute.</w:t>
-      </w:r>
-    </w:p>
-    <w:p>
-      <w:pPr>
-        <w:pStyle w:val="ListParagraph"/>
-        <w:numPr>
-          <w:ilvl w:val="0"/>
-          <w:numId w:val="2"/>
-        </w:numPr>
-        <w:spacing w:after="100" w:line="288"/>
-      </w:pPr>
-      <w:r>
-        <w:rPr>
-          <w:sz w:val="24"/>
-          <w:szCs w:val="24"/>
-        </w:rPr>
-        <w:t xml:space="preserve">Using third parties such as PayPal, which offer seller protection programs when the merchant follows their rules.</w:t>
+        <w:spacing w:after="80" w:line="288"/>
+      </w:pPr>
+      <w:r>
+        <w:rPr>
+          <w:sz w:val="24"/>
+          <w:szCs w:val="24"/>
+        </w:rPr>
+        <w:t xml:space="preserve">Services like PayPal offer seller protection when the merchant follows their rules.</w:t>
       </w:r>
     </w:p>
     <w:p>
       <w:pPr>
         <w:pStyle w:val="Heading2"/>
-        <w:spacing w:after="120" w:before="200"/>
-      </w:pPr>
-      <w:r>
-        <w:t xml:space="preserve">How Do Exchange Rates Affect Online Purchases?</w:t>
+        <w:spacing w:after="120" w:before="240"/>
+      </w:pPr>
+      <w:r>
+        <w:t xml:space="preserve">How do exchange rates affect online purchases?</w:t>
       </w:r>
     </w:p>
     <w:p>
@@ -1647,20 +1460,19 @@
       </w:pPr>
       <w:r>
         <w:rPr>
-          <w:rFonts w:ascii="Calibri" w:cs="Calibri" w:eastAsia="Calibri" w:hAnsi="Calibri"/>
-          <w:sz w:val="24"/>
-          <w:szCs w:val="24"/>
-        </w:rPr>
-        <w:t xml:space="preserve">Exchange rates change every day, so the same product can cost a foreign buyer more one week and less the next. When the U.S. dollar is strong, American products become more expensive for people overseas, and international sales tend to drop. The customer can also get hit with a foreign transaction fee from their bank, often around 3%, and the final amount on their statement may not match what they saw at checkout. Smart merchants handle this by showing prices in the shopper's local currency (multi-currency pricing), so there is no surprise. The merchant then takes on the exchange-rate risk, which they may cover by building a small buffer into prices.</w:t>
+          <w:sz w:val="24"/>
+          <w:szCs w:val="24"/>
+        </w:rPr>
+        <w:t xml:space="preserve">Exchange rates move every day, so the same product can cost a foreign buyer more one week than the next. When the dollar is strong, American goods get more expensive overseas and international sales drop. The buyer's bank may also add a foreign transaction fee, often around 3%, and the amount on their statement might not match what they saw at checkout. Many merchants handle this by showing prices in the shopper's own currency. The customer knows exactly what they'll pay, and the merchant takes on the exchange-rate risk, often by raising prices slightly to cover it.</w:t>
       </w:r>
     </w:p>
     <w:p>
       <w:pPr>
         <w:pStyle w:val="Heading2"/>
-        <w:spacing w:after="120" w:before="200"/>
-      </w:pPr>
-      <w:r>
-        <w:t xml:space="preserve">What About Shipping Charges?</w:t>
+        <w:spacing w:after="120" w:before="240"/>
+      </w:pPr>
+      <w:r>
+        <w:t xml:space="preserve">What about shipping charges?</w:t>
       </w:r>
     </w:p>
     <w:p>
@@ -1669,20 +1481,19 @@
       </w:pPr>
       <w:r>
         <w:rPr>
-          <w:rFonts w:ascii="Calibri" w:cs="Calibri" w:eastAsia="Calibri" w:hAnsi="Calibri"/>
-          <w:sz w:val="24"/>
-          <w:szCs w:val="24"/>
-        </w:rPr>
-        <w:t xml:space="preserve">Shipping is one of the biggest reasons international shoppers abandon their carts. Sending a small package overseas can easily cost $20 to $50 or more, sometimes more than the item itself. On top of that, customs duties and import taxes may be added. If those are collected when the package arrives (called DDU, or Delivered Duty Unpaid), the customer gets an unexpected bill at their door and may refuse the package. Many merchants now offer DDP (Delivered Duty Paid), where all taxes and duties are calculated and paid at checkout, so the price the customer sees is the price they pay. Delivery times are also longer, often one to three weeks, and returns are expensive and slow.</w:t>
+          <w:sz w:val="24"/>
+          <w:szCs w:val="24"/>
+        </w:rPr>
+        <w:t xml:space="preserve">Shipping is one of the main reasons international shoppers abandon their carts. Sending a small package overseas can cost $20 to $50 or more, sometimes more than the item. Customs duties and import taxes can come on top of that. If they're collected at the door (Delivered Duty Unpaid, or DDU), the customer gets a surprise bill and might refuse the package. More merchants now use Delivered Duty Paid (DDP), which charges all taxes and duties at checkout, so the price shown is the final price. Delivery still takes one to three weeks, and returns are slow and expensive.</w:t>
       </w:r>
     </w:p>
     <w:p>
       <w:pPr>
         <w:pStyle w:val="Heading2"/>
-        <w:spacing w:after="120" w:before="200"/>
-      </w:pPr>
-      <w:r>
-        <w:t xml:space="preserve">Summary: U.S. Customer vs. International Customer</w:t>
+        <w:spacing w:after="120" w:before="240"/>
+      </w:pPr>
+      <w:r>
+        <w:t xml:space="preserve">A U.S. customer vs. an international customer</w:t>
       </w:r>
     </w:p>
     <w:p>
@@ -1691,11 +1502,10 @@
       </w:pPr>
       <w:r>
         <w:rPr>
-          <w:rFonts w:ascii="Calibri" w:cs="Calibri" w:eastAsia="Calibri" w:hAnsi="Calibri"/>
-          <w:sz w:val="24"/>
-          <w:szCs w:val="24"/>
-        </w:rPr>
-        <w:t xml:space="preserve">To bring it all together, picture two people buying the same $60 jacket from a U.S. online store. One lives in Ohio and the other lives in the Philippines.</w:t>
+          <w:sz w:val="24"/>
+          <w:szCs w:val="24"/>
+        </w:rPr>
+        <w:t xml:space="preserve">Imagine two people buying the same $60 jacket from a U.S. online store. One lives in Ohio and the other lives in the Philippines.</w:t>
       </w:r>
     </w:p>
     <w:tbl>
@@ -1763,7 +1573,7 @@
                 <w:sz w:val="20"/>
                 <w:szCs w:val="20"/>
               </w:rPr>
-              <w:t xml:space="preserve">U.S. Customer</w:t>
+              <w:t xml:space="preserve">U.S. customer</w:t>
             </w:r>
           </w:p>
         </w:tc>
@@ -1787,7 +1597,7 @@
                 <w:sz w:val="20"/>
                 <w:szCs w:val="20"/>
               </w:rPr>
-              <w:t xml:space="preserve">International Customer</w:t>
+              <w:t xml:space="preserve">International customer</w:t>
             </w:r>
           </w:p>
         </w:tc>
@@ -1799,7 +1609,7 @@
         <w:tc>
           <w:tcPr>
             <w:tcW w:type="dxa" w:w="2200"/>
-            <w:shd w:fill="E8EEF7" w:color="auto" w:val="clear"/>
+            <w:shd w:fill="F2F2F2" w:color="auto" w:val="clear"/>
             <w:tcMar>
               <w:top w:type="dxa" w:w="80"/>
               <w:left w:type="dxa" w:w="100"/>
@@ -1839,7 +1649,7 @@
                 <w:sz w:val="20"/>
                 <w:szCs w:val="20"/>
               </w:rPr>
-              <w:t xml:space="preserve">Sees $60 in dollars; pays exactly that plus state sales tax.</w:t>
+              <w:t xml:space="preserve">Sees $60 and pays that plus state sales tax.</w:t>
             </w:r>
           </w:p>
         </w:tc>
@@ -1862,7 +1672,7 @@
                 <w:sz w:val="20"/>
                 <w:szCs w:val="20"/>
               </w:rPr>
-              <w:t xml:space="preserve">May see a converted price; final amount depends on the exchange rate that day.</w:t>
+              <w:t xml:space="preserve">Sees a converted price; the final amount depends on that day's exchange rate.</w:t>
             </w:r>
           </w:p>
         </w:tc>
@@ -1874,7 +1684,7 @@
         <w:tc>
           <w:tcPr>
             <w:tcW w:type="dxa" w:w="2200"/>
-            <w:shd w:fill="E8EEF7" w:color="auto" w:val="clear"/>
+            <w:shd w:fill="F2F2F2" w:color="auto" w:val="clear"/>
             <w:tcMar>
               <w:top w:type="dxa" w:w="80"/>
               <w:left w:type="dxa" w:w="100"/>
@@ -1914,7 +1724,7 @@
                 <w:sz w:val="20"/>
                 <w:szCs w:val="20"/>
               </w:rPr>
-              <w:t xml:space="preserve">Uses a credit or debit card, PayPal, Apple Pay; usually approved quickly.</w:t>
+              <w:t xml:space="preserve">Card, PayPal, or Apple Pay; usually approved right away.</w:t>
             </w:r>
           </w:p>
         </w:tc>
@@ -1937,7 +1747,7 @@
                 <w:sz w:val="20"/>
                 <w:szCs w:val="20"/>
               </w:rPr>
-              <w:t xml:space="preserve">May need to use a card that allows foreign purchases; more likely to be flagged or declined; may need 3-D Secure.</w:t>
+              <w:t xml:space="preserve">Needs a card that allows foreign purchases; more likely to be flagged or declined; may have to go through 3-D Secure.</w:t>
             </w:r>
           </w:p>
         </w:tc>
@@ -1949,7 +1759,7 @@
         <w:tc>
           <w:tcPr>
             <w:tcW w:type="dxa" w:w="2200"/>
-            <w:shd w:fill="E8EEF7" w:color="auto" w:val="clear"/>
+            <w:shd w:fill="F2F2F2" w:color="auto" w:val="clear"/>
             <w:tcMar>
               <w:top w:type="dxa" w:w="80"/>
               <w:left w:type="dxa" w:w="100"/>
@@ -2012,7 +1822,7 @@
                 <w:sz w:val="20"/>
                 <w:szCs w:val="20"/>
               </w:rPr>
-              <w:t xml:space="preserve">Possible 1%–3% foreign transaction fee from their bank.</w:t>
+              <w:t xml:space="preserve">Possibly a 1%–3% foreign transaction fee from their bank.</w:t>
             </w:r>
           </w:p>
         </w:tc>
@@ -2024,7 +1834,7 @@
         <w:tc>
           <w:tcPr>
             <w:tcW w:type="dxa" w:w="2200"/>
-            <w:shd w:fill="E8EEF7" w:color="auto" w:val="clear"/>
+            <w:shd w:fill="F2F2F2" w:color="auto" w:val="clear"/>
             <w:tcMar>
               <w:top w:type="dxa" w:w="80"/>
               <w:left w:type="dxa" w:w="100"/>
@@ -2099,7 +1909,7 @@
         <w:tc>
           <w:tcPr>
             <w:tcW w:type="dxa" w:w="2200"/>
-            <w:shd w:fill="E8EEF7" w:color="auto" w:val="clear"/>
+            <w:shd w:fill="F2F2F2" w:color="auto" w:val="clear"/>
             <w:tcMar>
               <w:top w:type="dxa" w:w="80"/>
               <w:left w:type="dxa" w:w="100"/>
@@ -2116,7 +1926,7 @@
                 <w:sz w:val="20"/>
                 <w:szCs w:val="20"/>
               </w:rPr>
-              <w:t xml:space="preserve">Taxes &amp; duties</w:t>
+              <w:t xml:space="preserve">Taxes and duties</w:t>
             </w:r>
           </w:p>
         </w:tc>
@@ -2162,7 +1972,7 @@
                 <w:sz w:val="20"/>
                 <w:szCs w:val="20"/>
               </w:rPr>
-              <w:t xml:space="preserve">Import duties and VAT, either paid at checkout or on delivery.</w:t>
+              <w:t xml:space="preserve">Import duties and VAT, paid at checkout or on delivery.</w:t>
             </w:r>
           </w:p>
         </w:tc>
@@ -2174,7 +1984,7 @@
         <w:tc>
           <w:tcPr>
             <w:tcW w:type="dxa" w:w="2200"/>
-            <w:shd w:fill="E8EEF7" w:color="auto" w:val="clear"/>
+            <w:shd w:fill="F2F2F2" w:color="auto" w:val="clear"/>
             <w:tcMar>
               <w:top w:type="dxa" w:w="80"/>
               <w:left w:type="dxa" w:w="100"/>
@@ -2237,7 +2047,7 @@
                 <w:sz w:val="20"/>
                 <w:szCs w:val="20"/>
               </w:rPr>
-              <w:t xml:space="preserve">Costly and slow; often not worth the trouble.</w:t>
+              <w:t xml:space="preserve">Expensive and slow; often not worth it.</w:t>
             </w:r>
           </w:p>
         </w:tc>
@@ -2249,7 +2059,7 @@
         <w:tc>
           <w:tcPr>
             <w:tcW w:type="dxa" w:w="2200"/>
-            <w:shd w:fill="E8EEF7" w:color="auto" w:val="clear"/>
+            <w:shd w:fill="F2F2F2" w:color="auto" w:val="clear"/>
             <w:tcMar>
               <w:top w:type="dxa" w:w="80"/>
               <w:left w:type="dxa" w:w="100"/>
@@ -2266,7 +2076,7 @@
                 <w:sz w:val="20"/>
                 <w:szCs w:val="20"/>
               </w:rPr>
-              <w:t xml:space="preserve">Buyer protection</w:t>
+              <w:t xml:space="preserve">If something goes wrong</w:t>
             </w:r>
           </w:p>
         </w:tc>
@@ -2289,7 +2099,7 @@
                 <w:sz w:val="20"/>
                 <w:szCs w:val="20"/>
               </w:rPr>
-              <w:t xml:space="preserve">Strong U.S. consumer protection laws and easy chargebacks.</w:t>
+              <w:t xml:space="preserve">Strong U.S. consumer protection and easy chargebacks.</w:t>
             </w:r>
           </w:p>
         </w:tc>
@@ -2312,7 +2122,7 @@
                 <w:sz w:val="20"/>
                 <w:szCs w:val="20"/>
               </w:rPr>
-              <w:t xml:space="preserve">Has to rely on their card issuer or PayPal; harder to resolve disputes across borders.</w:t>
+              <w:t xml:space="preserve">Has to rely on their card issuer or PayPal; disputes across borders are harder.</w:t>
             </w:r>
           </w:p>
         </w:tc>
@@ -2320,11 +2130,10 @@
     </w:tbl>
     <w:p>
       <w:pPr>
-        <w:spacing w:after="120"/>
-      </w:pPr>
-      <w:r>
-        <w:rPr>
-          <w:rFonts w:ascii="Calibri" w:cs="Calibri" w:eastAsia="Calibri" w:hAnsi="Calibri"/>
+        <w:spacing w:after="160" w:line="300"/>
+      </w:pPr>
+      <w:r>
+        <w:rPr>
           <w:sz w:val="24"/>
           <w:szCs w:val="24"/>
         </w:rPr>
@@ -2337,20 +2146,19 @@
       </w:pPr>
       <w:r>
         <w:rPr>
-          <w:rFonts w:ascii="Calibri" w:cs="Calibri" w:eastAsia="Calibri" w:hAnsi="Calibri"/>
-          <w:sz w:val="24"/>
-          <w:szCs w:val="24"/>
-        </w:rPr>
-        <w:t xml:space="preserve">In short, the U.S. customer gets a simple, fast, and predictable experience, while the international customer deals with currency conversion, extra fees, higher shipping costs, possible customs charges, and longer waits. For the merchant, the international sale carries more risk of fraud and chargebacks. Businesses that want to grow globally have to close that gap by offering local payment methods, showing prices in local currency, being upfront about duties, and using strong fraud and authentication tools. The ones that do it well open the door to customers all over the world.</w:t>
+          <w:sz w:val="24"/>
+          <w:szCs w:val="24"/>
+        </w:rPr>
+        <w:t xml:space="preserve">The Ohio shopper has an easy time: a familiar price, quick delivery, and simple returns. The shopper in the Philippines deals with currency conversion, extra fees, expensive shipping, possible customs charges, and a long wait, with less protection if something goes wrong. For the merchant, the overseas order carries more risk of fraud and chargebacks. A store that wants international customers has to narrow that gap by accepting local payment methods, showing prices in local currency, charging duties up front, and using good fraud tools.</w:t>
       </w:r>
     </w:p>
     <w:p>
       <w:pPr>
         <w:pStyle w:val="Heading2"/>
-        <w:spacing w:after="120" w:before="200"/>
-      </w:pPr>
-      <w:r>
-        <w:t xml:space="preserve">Presentation Summary (Part B)</w:t>
+        <w:spacing w:after="120" w:before="240"/>
+      </w:pPr>
+      <w:r>
+        <w:t xml:space="preserve">Key points for the presentation</w:t>
       </w:r>
     </w:p>
     <w:p>
@@ -2360,14 +2168,14 @@
           <w:ilvl w:val="0"/>
           <w:numId w:val="2"/>
         </w:numPr>
-        <w:spacing w:after="100" w:line="288"/>
-      </w:pPr>
-      <w:r>
-        <w:rPr>
-          <w:sz w:val="24"/>
-          <w:szCs w:val="24"/>
-        </w:rPr>
-        <w:t xml:space="preserve">Cross-border sales are growing fast, but come with higher fees, fraud risk, and legal rules.</w:t>
+        <w:spacing w:after="80" w:line="288"/>
+      </w:pPr>
+      <w:r>
+        <w:rPr>
+          <w:sz w:val="24"/>
+          <w:szCs w:val="24"/>
+        </w:rPr>
+        <w:t xml:space="preserve">Cross-border sales keep growing, but they come with higher fees, more fraud, and more legal rules.</w:t>
       </w:r>
     </w:p>
     <w:p>
@@ -2377,14 +2185,14 @@
           <w:ilvl w:val="0"/>
           <w:numId w:val="2"/>
         </w:numPr>
-        <w:spacing w:after="100" w:line="288"/>
-      </w:pPr>
-      <w:r>
-        <w:rPr>
-          <w:sz w:val="24"/>
-          <w:szCs w:val="24"/>
-        </w:rPr>
-        <w:t xml:space="preserve">Repudiation is reduced with 3-D Secure, AVS/CVV checks, fraud tools, and tracked delivery.</w:t>
+        <w:spacing w:after="80" w:line="288"/>
+      </w:pPr>
+      <w:r>
+        <w:rPr>
+          <w:sz w:val="24"/>
+          <w:szCs w:val="24"/>
+        </w:rPr>
+        <w:t xml:space="preserve">3-D Secure, AVS/CVV checks, fraud tools, and tracked delivery reduce repudiation.</w:t>
       </w:r>
     </w:p>
     <w:p>
@@ -2394,14 +2202,14 @@
           <w:ilvl w:val="0"/>
           <w:numId w:val="2"/>
         </w:numPr>
-        <w:spacing w:after="100" w:line="288"/>
-      </w:pPr>
-      <w:r>
-        <w:rPr>
-          <w:sz w:val="24"/>
-          <w:szCs w:val="24"/>
-        </w:rPr>
-        <w:t xml:space="preserve">Exchange rates change what foreign buyers pay; local-currency pricing removes the surprise.</w:t>
+        <w:spacing w:after="80" w:line="288"/>
+      </w:pPr>
+      <w:r>
+        <w:rPr>
+          <w:sz w:val="24"/>
+          <w:szCs w:val="24"/>
+        </w:rPr>
+        <w:t xml:space="preserve">Exchange rates change what foreign buyers pay; pricing in local currency removes the surprise.</w:t>
       </w:r>
     </w:p>
     <w:p>
@@ -2411,14 +2219,14 @@
           <w:ilvl w:val="0"/>
           <w:numId w:val="2"/>
         </w:numPr>
-        <w:spacing w:after="100" w:line="288"/>
-      </w:pPr>
-      <w:r>
-        <w:rPr>
-          <w:sz w:val="24"/>
-          <w:szCs w:val="24"/>
-        </w:rPr>
-        <w:t xml:space="preserve">Shipping costs and customs duties are the top reasons international carts get abandoned.</w:t>
+        <w:spacing w:after="80" w:line="288"/>
+      </w:pPr>
+      <w:r>
+        <w:rPr>
+          <w:sz w:val="24"/>
+          <w:szCs w:val="24"/>
+        </w:rPr>
+        <w:t xml:space="preserve">Shipping costs and customs duties are top reasons international carts get abandoned.</w:t>
       </w:r>
     </w:p>
     <w:p>
@@ -2428,7 +2236,7 @@
           <w:ilvl w:val="0"/>
           <w:numId w:val="2"/>
         </w:numPr>
-        <w:spacing w:after="100" w:line="288"/>
+        <w:spacing w:after="80" w:line="288"/>
       </w:pPr>
       <w:r>
         <w:rPr>
@@ -2849,7 +2657,7 @@
     <w:rPr>
       <w:b/>
       <w:bCs/>
-      <w:color w:val="2E5597"/>
+      <w:color w:val="1F3864"/>
       <w:sz w:val="26"/>
       <w:szCs w:val="26"/>
     </w:rPr>

</xml_diff>